<commit_message>
Wzor_analizy: pozycje niepotwierdzone sprawdzone w plikach programu 2610 - nazwa wydzialu 100 znakow (kod 20), raport Lista nierozliczonych elementow (Wydruki/Wynagrodzenia i zasilki), parametry ujemnej podstawy ZUS, konfiguracja rozszerzonego zapisu zmian
Co-Authored-By: Claude Opus 5.5 <noreply@anthropic.com>
Claude-Session: https://claude.ai/code/session_01MPv8DQFG5hE89BDXdF7Lue
</commit_message>
<xml_diff>
--- a/Wzor_analizy/Wzor_ZAL_03_Place_KPCP.docx
+++ b/Wzor_analizy/Wzor_ZAL_03_Place_KPCP.docx
@@ -1820,7 +1820,7 @@
         <w:pStyle w:val="Normalny"/>
       </w:pPr>
       <w:r>
-        <w:t xml:space="preserve">W programie nie ma potrzeby konfigurowania elementów służących do korygowania nieobecności, wynagrodzenia lub dodatków i potrąceń. Poprzez wybranie odpowiednich parametrów naliczania wypłat system sprawdzi, które elementy uległy zmianie względem pierwotnego naliczenia lub nie zostały rozliczone, i dokona stosownych korekt. Do sprawdzenia nierozliczonych elementów za wcześniejsze okresy służy raport Lista nierozliczonych elementów wywoływany z listy pracowników.</w:t>
+        <w:t xml:space="preserve">W programie nie ma potrzeby konfigurowania elementów służących do korygowania nieobecności, wynagrodzenia lub dodatków i potrąceń. Poprzez wybranie odpowiednich parametrów naliczania wypłat system sprawdzi, które elementy uległy zmianie względem pierwotnego naliczenia lub nie zostały rozliczone, i dokona stosownych korekt. Do sprawdzenia nierozliczonych elementów za wcześniejsze okresy służy raport Lista nierozliczonych elementów wywoływany z listy pracowników (Wydruki/Wynagrodzenia i zasiłki).</w:t>
       </w:r>
     </w:p>
     <w:p>
@@ -2395,7 +2395,7 @@
         <w:pStyle w:val="Listapunktowana"/>
       </w:pPr>
       <w:r>
-        <w:t xml:space="preserve">wypłata zaliczki na wynagrodzenie, która skoryguje ujemną podstawę tak, aby w podstawie wykazana była kwota 0 – w momencie powrotu pracownika do pracy nastąpi automatyczne potrącenie zaliczki;</w:t>
+        <w:t xml:space="preserve">wypłata zaliczki na wynagrodzenie, która skoryguje ujemną podstawę tak, aby w podstawie wykazana była kwota 0 – w momencie powrotu pracownika do pracy nastąpi automatyczne potrącenie zaliczki (parametr „W przypadku naliczenia ujemnej podstawy składek ZUS (…) wypłać zaliczkę w kwocie ujemnej podstawy składek” w Narzędzia/Opcje/Kadry i płace/Płace/Składki ZUS);</w:t>
       </w:r>
     </w:p>
     <w:p>
@@ -2403,7 +2403,7 @@
         <w:pStyle w:val="Listapunktowana"/>
       </w:pPr>
       <w:r>
-        <w:t xml:space="preserve">zapisanie naliczonej wypłaty z ujemną podstawą składek i ręczna korekta deklaracji w programie Płatnik.</w:t>
+        <w:t xml:space="preserve">zapisanie naliczonej wypłaty z ujemną podstawą składek i ręczna korekta deklaracji w programie Płatnik – wymaga wyłączenia domyślnie zaznaczonego parametru „Nie dopuszczaj do zapisania wypłat z ujemnymi podstawami naliczania składek ZUS lub zaliczki podatku” (Narzędzia/Opcje/Kadry i płace/Płace/Ogólne).</w:t>
       </w:r>
     </w:p>
     <w:p>

</xml_diff>